<commit_message>
sistemazione nomenclatura degli script e dei nomi nei commenti
</commit_message>
<xml_diff>
--- a/Guida_FreudKB_Completa.docx
+++ b/Guida_FreudKB_Completa.docx
@@ -5,335 +5,1114 @@
     <w:p>
       <w:pPr>
         <w:pStyle w:val="Titolo1"/>
+        <w:rPr>
+          <w:lang w:val="it-IT"/>
+        </w:rPr>
       </w:pPr>
       <w:r>
+        <w:rPr>
+          <w:lang w:val="it-IT"/>
+        </w:rPr>
         <w:t>Guida Completa: Creazione Pipeline RAG Freud-KB</w:t>
       </w:r>
     </w:p>
     <w:p>
-      <w:r>
-        <w:t>Questa guida spiega in modo semplice ma completo tutto ciò che è stato fatto per creare la pipeline RAG (Retrieval Augmented Generation) del progetto Freud-KB. È pensata per essere letta e seguita da Kevin, così da poter replicare l’intero processo da zero, senza bisogno di competenze pregresse.</w:t>
-      </w:r>
-      <w:r>
+      <w:pPr>
+        <w:rPr>
+          <w:lang w:val="it-IT"/>
+        </w:rPr>
+      </w:pPr>
+      <w:r>
+        <w:rPr>
+          <w:lang w:val="it-IT"/>
+        </w:rPr>
+        <w:t>Questa guida spiega in modo semplice ma completo tutto ciò che è stato fatto per creare la pipeline RAG (</w:t>
+      </w:r>
+      <w:proofErr w:type="spellStart"/>
+      <w:r>
+        <w:rPr>
+          <w:lang w:val="it-IT"/>
+        </w:rPr>
+        <w:t>Retrieval</w:t>
+      </w:r>
+      <w:proofErr w:type="spellEnd"/>
+      <w:r>
+        <w:rPr>
+          <w:lang w:val="it-IT"/>
+        </w:rPr>
+        <w:t xml:space="preserve"> </w:t>
+      </w:r>
+      <w:proofErr w:type="spellStart"/>
+      <w:r>
+        <w:rPr>
+          <w:lang w:val="it-IT"/>
+        </w:rPr>
+        <w:t>Augmented</w:t>
+      </w:r>
+      <w:proofErr w:type="spellEnd"/>
+      <w:r>
+        <w:rPr>
+          <w:lang w:val="it-IT"/>
+        </w:rPr>
+        <w:t xml:space="preserve"> Generation) del progetto Freud-KB. È pensata per essere letta e seguita da Kevin, così da poter replicare l’intero processo da zero, senza bisogno di competenze pregresse.</w:t>
+      </w:r>
+      <w:r>
+        <w:rPr>
+          <w:lang w:val="it-IT"/>
+        </w:rPr>
         <w:br/>
       </w:r>
       <w:r>
+        <w:rPr>
+          <w:lang w:val="it-IT"/>
+        </w:rPr>
         <w:br/>
         <w:t>La guida include:</w:t>
       </w:r>
       <w:r>
+        <w:rPr>
+          <w:lang w:val="it-IT"/>
+        </w:rPr>
         <w:br/>
         <w:t>- spiegazione della tecnologia utilizzata</w:t>
       </w:r>
       <w:r>
+        <w:rPr>
+          <w:lang w:val="it-IT"/>
+        </w:rPr>
         <w:br/>
         <w:t>- installazione dell’ambiente di sviluppo</w:t>
       </w:r>
       <w:r>
+        <w:rPr>
+          <w:lang w:val="it-IT"/>
+        </w:rPr>
         <w:br/>
         <w:t>- preparazione del progetto</w:t>
       </w:r>
       <w:r>
+        <w:rPr>
+          <w:lang w:val="it-IT"/>
+        </w:rPr>
         <w:br/>
-        <w:t>- creazione della knowledge base (enrichment + chunking)</w:t>
-      </w:r>
-      <w:r>
+        <w:t>- creazione della knowledge base (</w:t>
+      </w:r>
+      <w:proofErr w:type="spellStart"/>
+      <w:r>
+        <w:rPr>
+          <w:lang w:val="it-IT"/>
+        </w:rPr>
+        <w:t>enrichment</w:t>
+      </w:r>
+      <w:proofErr w:type="spellEnd"/>
+      <w:r>
+        <w:rPr>
+          <w:lang w:val="it-IT"/>
+        </w:rPr>
+        <w:t xml:space="preserve"> + chunking)</w:t>
+      </w:r>
+      <w:r>
+        <w:rPr>
+          <w:lang w:val="it-IT"/>
+        </w:rPr>
         <w:br/>
-        <w:t>- creazione embedding tramite Ollama</w:t>
-      </w:r>
-      <w:r>
+        <w:t xml:space="preserve">- creazione </w:t>
+      </w:r>
+      <w:proofErr w:type="spellStart"/>
+      <w:r>
+        <w:rPr>
+          <w:lang w:val="it-IT"/>
+        </w:rPr>
+        <w:t>embedding</w:t>
+      </w:r>
+      <w:proofErr w:type="spellEnd"/>
+      <w:r>
+        <w:rPr>
+          <w:lang w:val="it-IT"/>
+        </w:rPr>
+        <w:t xml:space="preserve"> tramite Ollama</w:t>
+      </w:r>
+      <w:r>
+        <w:rPr>
+          <w:lang w:val="it-IT"/>
+        </w:rPr>
         <w:br/>
-        <w:t>- indicizzazione con ChromaDB</w:t>
-      </w:r>
-      <w:r>
+        <w:t xml:space="preserve">- indicizzazione con </w:t>
+      </w:r>
+      <w:proofErr w:type="spellStart"/>
+      <w:r>
+        <w:rPr>
+          <w:lang w:val="it-IT"/>
+        </w:rPr>
+        <w:t>ChromaDB</w:t>
+      </w:r>
+      <w:proofErr w:type="spellEnd"/>
+      <w:r>
+        <w:rPr>
+          <w:lang w:val="it-IT"/>
+        </w:rPr>
         <w:br/>
         <w:t>- test del RAG</w:t>
       </w:r>
       <w:r>
+        <w:rPr>
+          <w:lang w:val="it-IT"/>
+        </w:rPr>
         <w:br/>
         <w:t>- possibilità di estendere tutto in Azure</w:t>
       </w:r>
       <w:r>
+        <w:rPr>
+          <w:lang w:val="it-IT"/>
+        </w:rPr>
         <w:br/>
       </w:r>
     </w:p>
     <w:p>
       <w:pPr>
         <w:pStyle w:val="Titolo2"/>
+        <w:rPr>
+          <w:lang w:val="it-IT"/>
+        </w:rPr>
       </w:pPr>
       <w:r>
+        <w:rPr>
+          <w:lang w:val="it-IT"/>
+        </w:rPr>
         <w:t>1. Quale tecnologia stiamo usando</w:t>
       </w:r>
     </w:p>
     <w:p>
-      <w:r>
-        <w:t>Il progetto utilizza un’architettura moderna chiamata RAG (Retrieval Augmented Generation). Si compone di tre elementi principali:</w:t>
-      </w:r>
-      <w:r>
+      <w:pPr>
+        <w:rPr>
+          <w:lang w:val="it-IT"/>
+        </w:rPr>
+      </w:pPr>
+      <w:r>
+        <w:rPr>
+          <w:lang w:val="it-IT"/>
+        </w:rPr>
+        <w:t>Il progetto utilizza un’architettura moderna chiamata RAG (</w:t>
+      </w:r>
+      <w:proofErr w:type="spellStart"/>
+      <w:r>
+        <w:rPr>
+          <w:lang w:val="it-IT"/>
+        </w:rPr>
+        <w:t>Retrieval</w:t>
+      </w:r>
+      <w:proofErr w:type="spellEnd"/>
+      <w:r>
+        <w:rPr>
+          <w:lang w:val="it-IT"/>
+        </w:rPr>
+        <w:t xml:space="preserve"> </w:t>
+      </w:r>
+      <w:proofErr w:type="spellStart"/>
+      <w:r>
+        <w:rPr>
+          <w:lang w:val="it-IT"/>
+        </w:rPr>
+        <w:t>Augmented</w:t>
+      </w:r>
+      <w:proofErr w:type="spellEnd"/>
+      <w:r>
+        <w:rPr>
+          <w:lang w:val="it-IT"/>
+        </w:rPr>
+        <w:t xml:space="preserve"> Generation). Si compone di tre elementi principali:</w:t>
+      </w:r>
+      <w:r>
+        <w:rPr>
+          <w:lang w:val="it-IT"/>
+        </w:rPr>
         <w:br/>
       </w:r>
       <w:r>
+        <w:rPr>
+          <w:lang w:val="it-IT"/>
+        </w:rPr>
         <w:br/>
-        <w:t>1. Python: per elaborare, pulire e suddividere in chunk i contenuti.</w:t>
-      </w:r>
-      <w:r>
+        <w:t xml:space="preserve">1. Python: per elaborare, pulire e suddividere in </w:t>
+      </w:r>
+      <w:proofErr w:type="spellStart"/>
+      <w:r>
+        <w:rPr>
+          <w:lang w:val="it-IT"/>
+        </w:rPr>
+        <w:t>chunk</w:t>
+      </w:r>
+      <w:proofErr w:type="spellEnd"/>
+      <w:r>
+        <w:rPr>
+          <w:lang w:val="it-IT"/>
+        </w:rPr>
+        <w:t xml:space="preserve"> i contenuti.</w:t>
+      </w:r>
+      <w:r>
+        <w:rPr>
+          <w:lang w:val="it-IT"/>
+        </w:rPr>
         <w:br/>
-        <w:t>2. Ollama: server locale che genera embeddings tramite modelli AI.</w:t>
-      </w:r>
-      <w:r>
+        <w:t xml:space="preserve">2. Ollama: server locale che genera </w:t>
+      </w:r>
+      <w:proofErr w:type="spellStart"/>
+      <w:r>
+        <w:rPr>
+          <w:lang w:val="it-IT"/>
+        </w:rPr>
+        <w:t>embeddings</w:t>
+      </w:r>
+      <w:proofErr w:type="spellEnd"/>
+      <w:r>
+        <w:rPr>
+          <w:lang w:val="it-IT"/>
+        </w:rPr>
+        <w:t xml:space="preserve"> tramite modelli AI.</w:t>
+      </w:r>
+      <w:r>
+        <w:rPr>
+          <w:lang w:val="it-IT"/>
+        </w:rPr>
         <w:br/>
-        <w:t>3. ChromaDB: database vettoriale che memorizza gli embeddings e permette ricerche semantiche.</w:t>
-      </w:r>
-      <w:r>
+        <w:t xml:space="preserve">3. </w:t>
+      </w:r>
+      <w:proofErr w:type="spellStart"/>
+      <w:r>
+        <w:rPr>
+          <w:lang w:val="it-IT"/>
+        </w:rPr>
+        <w:t>ChromaDB</w:t>
+      </w:r>
+      <w:proofErr w:type="spellEnd"/>
+      <w:r>
+        <w:rPr>
+          <w:lang w:val="it-IT"/>
+        </w:rPr>
+        <w:t xml:space="preserve">: database vettoriale che memorizza gli </w:t>
+      </w:r>
+      <w:proofErr w:type="spellStart"/>
+      <w:r>
+        <w:rPr>
+          <w:lang w:val="it-IT"/>
+        </w:rPr>
+        <w:t>embeddings</w:t>
+      </w:r>
+      <w:proofErr w:type="spellEnd"/>
+      <w:r>
+        <w:rPr>
+          <w:lang w:val="it-IT"/>
+        </w:rPr>
+        <w:t xml:space="preserve"> e permette ricerche semantiche.</w:t>
+      </w:r>
+      <w:r>
+        <w:rPr>
+          <w:lang w:val="it-IT"/>
+        </w:rPr>
         <w:br/>
       </w:r>
       <w:r>
+        <w:rPr>
+          <w:lang w:val="it-IT"/>
+        </w:rPr>
         <w:br/>
         <w:t>Questa combinazione permette di creare un sistema intelligente che risponde alle domande basandosi sui contenuti reali del sito Freud.</w:t>
       </w:r>
       <w:r>
+        <w:rPr>
+          <w:lang w:val="it-IT"/>
+        </w:rPr>
         <w:br/>
       </w:r>
     </w:p>
     <w:p>
       <w:pPr>
         <w:pStyle w:val="Titolo2"/>
+        <w:rPr>
+          <w:lang w:val="it-IT"/>
+        </w:rPr>
       </w:pPr>
       <w:r>
+        <w:rPr>
+          <w:lang w:val="it-IT"/>
+        </w:rPr>
         <w:t>2. Installazione dell’ambiente di sviluppo</w:t>
       </w:r>
     </w:p>
     <w:p>
-      <w:r>
+      <w:pPr>
+        <w:rPr>
+          <w:lang w:val="it-IT"/>
+        </w:rPr>
+      </w:pPr>
+      <w:r>
+        <w:rPr>
+          <w:lang w:val="it-IT"/>
+        </w:rPr>
         <w:t>1. Installare Python 3.12</w:t>
       </w:r>
       <w:r>
+        <w:rPr>
+          <w:lang w:val="it-IT"/>
+        </w:rPr>
         <w:br/>
         <w:t>2. Installare Visual Studio Code</w:t>
       </w:r>
       <w:r>
+        <w:rPr>
+          <w:lang w:val="it-IT"/>
+        </w:rPr>
         <w:br/>
-        <w:t>3. Installare Git (opzionale)</w:t>
-      </w:r>
-      <w:r>
+        <w:t xml:space="preserve">3. Installare </w:t>
+      </w:r>
+      <w:proofErr w:type="spellStart"/>
+      <w:r>
+        <w:rPr>
+          <w:lang w:val="it-IT"/>
+        </w:rPr>
+        <w:t>Git</w:t>
+      </w:r>
+      <w:proofErr w:type="spellEnd"/>
+      <w:r>
+        <w:rPr>
+          <w:lang w:val="it-IT"/>
+        </w:rPr>
+        <w:t xml:space="preserve"> (opzionale)</w:t>
+      </w:r>
+      <w:r>
+        <w:rPr>
+          <w:lang w:val="it-IT"/>
+        </w:rPr>
         <w:br/>
         <w:t>4. Creare una cartella di progetto fuori da OneDrive, ad esempio C:\LAVORO\s_Freud</w:t>
       </w:r>
       <w:r>
+        <w:rPr>
+          <w:lang w:val="it-IT"/>
+        </w:rPr>
         <w:br/>
         <w:t>5. Creare ambiente virtuale:</w:t>
       </w:r>
       <w:r>
+        <w:rPr>
+          <w:lang w:val="it-IT"/>
+        </w:rPr>
         <w:br/>
-        <w:t xml:space="preserve">   python -m venv .venv</w:t>
-      </w:r>
-      <w:r>
+        <w:t xml:space="preserve">   </w:t>
+      </w:r>
+      <w:proofErr w:type="spellStart"/>
+      <w:r>
+        <w:rPr>
+          <w:lang w:val="it-IT"/>
+        </w:rPr>
+        <w:t>python</w:t>
+      </w:r>
+      <w:proofErr w:type="spellEnd"/>
+      <w:r>
+        <w:rPr>
+          <w:lang w:val="it-IT"/>
+        </w:rPr>
+        <w:t xml:space="preserve"> -m </w:t>
+      </w:r>
+      <w:proofErr w:type="spellStart"/>
+      <w:proofErr w:type="gramStart"/>
+      <w:r>
+        <w:rPr>
+          <w:lang w:val="it-IT"/>
+        </w:rPr>
+        <w:t>venv</w:t>
+      </w:r>
+      <w:proofErr w:type="spellEnd"/>
+      <w:r>
+        <w:rPr>
+          <w:lang w:val="it-IT"/>
+        </w:rPr>
+        <w:t xml:space="preserve"> .</w:t>
+      </w:r>
+      <w:proofErr w:type="spellStart"/>
+      <w:r>
+        <w:rPr>
+          <w:lang w:val="it-IT"/>
+        </w:rPr>
+        <w:t>venv</w:t>
+      </w:r>
+      <w:proofErr w:type="spellEnd"/>
+      <w:proofErr w:type="gramEnd"/>
+      <w:r>
+        <w:rPr>
+          <w:lang w:val="it-IT"/>
+        </w:rPr>
         <w:br/>
         <w:t>6. Attivarlo:</w:t>
       </w:r>
       <w:r>
+        <w:rPr>
+          <w:lang w:val="it-IT"/>
+        </w:rPr>
         <w:br/>
-        <w:t xml:space="preserve">   .\.venv\Scripts\activate</w:t>
-      </w:r>
-      <w:r>
+        <w:t xml:space="preserve"> </w:t>
+      </w:r>
+      <w:proofErr w:type="gramStart"/>
+      <w:r>
+        <w:rPr>
+          <w:lang w:val="it-IT"/>
+        </w:rPr>
+        <w:t xml:space="preserve">  .</w:t>
+      </w:r>
+      <w:proofErr w:type="gramEnd"/>
+      <w:r>
+        <w:rPr>
+          <w:lang w:val="it-IT"/>
+        </w:rPr>
+        <w:t>\.</w:t>
+      </w:r>
+      <w:proofErr w:type="spellStart"/>
+      <w:r>
+        <w:rPr>
+          <w:lang w:val="it-IT"/>
+        </w:rPr>
+        <w:t>venv</w:t>
+      </w:r>
+      <w:proofErr w:type="spellEnd"/>
+      <w:r>
+        <w:rPr>
+          <w:lang w:val="it-IT"/>
+        </w:rPr>
+        <w:t>\Scripts\</w:t>
+      </w:r>
+      <w:proofErr w:type="spellStart"/>
+      <w:r>
+        <w:rPr>
+          <w:lang w:val="it-IT"/>
+        </w:rPr>
+        <w:t>activate</w:t>
+      </w:r>
+      <w:proofErr w:type="spellEnd"/>
+      <w:r>
+        <w:rPr>
+          <w:lang w:val="it-IT"/>
+        </w:rPr>
         <w:br/>
         <w:t>7. Installare le dipendenze:</w:t>
       </w:r>
       <w:r>
+        <w:rPr>
+          <w:lang w:val="it-IT"/>
+        </w:rPr>
         <w:br/>
-        <w:t xml:space="preserve">   pip install -r requirements.txt</w:t>
-      </w:r>
-      <w:r>
+        <w:t xml:space="preserve">   </w:t>
+      </w:r>
+      <w:proofErr w:type="spellStart"/>
+      <w:r>
+        <w:rPr>
+          <w:lang w:val="it-IT"/>
+        </w:rPr>
+        <w:t>pip</w:t>
+      </w:r>
+      <w:proofErr w:type="spellEnd"/>
+      <w:r>
+        <w:rPr>
+          <w:lang w:val="it-IT"/>
+        </w:rPr>
+        <w:t xml:space="preserve"> </w:t>
+      </w:r>
+      <w:proofErr w:type="spellStart"/>
+      <w:r>
+        <w:rPr>
+          <w:lang w:val="it-IT"/>
+        </w:rPr>
+        <w:t>install</w:t>
+      </w:r>
+      <w:proofErr w:type="spellEnd"/>
+      <w:r>
+        <w:rPr>
+          <w:lang w:val="it-IT"/>
+        </w:rPr>
+        <w:t xml:space="preserve"> -r requirements.txt</w:t>
+      </w:r>
+      <w:r>
+        <w:rPr>
+          <w:lang w:val="it-IT"/>
+        </w:rPr>
         <w:br/>
       </w:r>
     </w:p>
     <w:p>
       <w:pPr>
         <w:pStyle w:val="Titolo2"/>
+        <w:rPr>
+          <w:lang w:val="it-IT"/>
+        </w:rPr>
       </w:pPr>
       <w:r>
+        <w:rPr>
+          <w:lang w:val="it-IT"/>
+        </w:rPr>
         <w:lastRenderedPageBreak/>
-        <w:t>3. Configurazione file .env</w:t>
-      </w:r>
+        <w:t xml:space="preserve">3. Configurazione </w:t>
+      </w:r>
+      <w:proofErr w:type="gramStart"/>
+      <w:r>
+        <w:rPr>
+          <w:lang w:val="it-IT"/>
+        </w:rPr>
+        <w:t>file .</w:t>
+      </w:r>
+      <w:proofErr w:type="spellStart"/>
+      <w:r>
+        <w:rPr>
+          <w:lang w:val="it-IT"/>
+        </w:rPr>
+        <w:t>env</w:t>
+      </w:r>
+      <w:proofErr w:type="spellEnd"/>
+      <w:proofErr w:type="gramEnd"/>
     </w:p>
     <w:p>
-      <w:r>
-        <w:t>Il file .env contiene i percorsi e i parametri di configurazione.</w:t>
-      </w:r>
-      <w:r>
+      <w:pPr>
+        <w:rPr>
+          <w:lang w:val="it-IT"/>
+        </w:rPr>
+      </w:pPr>
+      <w:r>
+        <w:rPr>
+          <w:lang w:val="it-IT"/>
+        </w:rPr>
+        <w:t xml:space="preserve">Il </w:t>
+      </w:r>
+      <w:proofErr w:type="gramStart"/>
+      <w:r>
+        <w:rPr>
+          <w:lang w:val="it-IT"/>
+        </w:rPr>
+        <w:t>file .</w:t>
+      </w:r>
+      <w:proofErr w:type="spellStart"/>
+      <w:r>
+        <w:rPr>
+          <w:lang w:val="it-IT"/>
+        </w:rPr>
+        <w:t>env</w:t>
+      </w:r>
+      <w:proofErr w:type="spellEnd"/>
+      <w:proofErr w:type="gramEnd"/>
+      <w:r>
+        <w:rPr>
+          <w:lang w:val="it-IT"/>
+        </w:rPr>
+        <w:t xml:space="preserve"> contiene i percorsi e i parametri di configurazione.</w:t>
+      </w:r>
+      <w:r>
+        <w:rPr>
+          <w:lang w:val="it-IT"/>
+        </w:rPr>
         <w:br/>
         <w:t>Esempio:</w:t>
       </w:r>
       <w:r>
+        <w:rPr>
+          <w:lang w:val="it-IT"/>
+        </w:rPr>
         <w:br/>
         <w:t>PROJECT_DIR=.</w:t>
       </w:r>
       <w:r>
+        <w:rPr>
+          <w:lang w:val="it-IT"/>
+        </w:rPr>
         <w:br/>
-        <w:t>BUILD_DIR=./build</w:t>
-      </w:r>
-      <w:r>
+        <w:t>BUILD_DIR</w:t>
+      </w:r>
+      <w:proofErr w:type="gramStart"/>
+      <w:r>
+        <w:rPr>
+          <w:lang w:val="it-IT"/>
+        </w:rPr>
+        <w:t>=./</w:t>
+      </w:r>
+      <w:proofErr w:type="gramEnd"/>
+      <w:r>
+        <w:rPr>
+          <w:lang w:val="it-IT"/>
+        </w:rPr>
+        <w:t>build</w:t>
+      </w:r>
+      <w:r>
+        <w:rPr>
+          <w:lang w:val="it-IT"/>
+        </w:rPr>
         <w:br/>
-        <w:t>DATA_DIR=./data</w:t>
-      </w:r>
-      <w:r>
+        <w:t>DATA_DIR</w:t>
+      </w:r>
+      <w:proofErr w:type="gramStart"/>
+      <w:r>
+        <w:rPr>
+          <w:lang w:val="it-IT"/>
+        </w:rPr>
+        <w:t>=./</w:t>
+      </w:r>
+      <w:proofErr w:type="gramEnd"/>
+      <w:r>
+        <w:rPr>
+          <w:lang w:val="it-IT"/>
+        </w:rPr>
+        <w:t>data</w:t>
+      </w:r>
+      <w:r>
+        <w:rPr>
+          <w:lang w:val="it-IT"/>
+        </w:rPr>
         <w:br/>
-        <w:t>PAGES_DIR=./build/pages</w:t>
-      </w:r>
-      <w:r>
+        <w:t>PAGES_DIR</w:t>
+      </w:r>
+      <w:proofErr w:type="gramStart"/>
+      <w:r>
+        <w:rPr>
+          <w:lang w:val="it-IT"/>
+        </w:rPr>
+        <w:t>=./</w:t>
+      </w:r>
+      <w:proofErr w:type="gramEnd"/>
+      <w:r>
+        <w:rPr>
+          <w:lang w:val="it-IT"/>
+        </w:rPr>
+        <w:t>build/pages</w:t>
+      </w:r>
+      <w:r>
+        <w:rPr>
+          <w:lang w:val="it-IT"/>
+        </w:rPr>
         <w:br/>
         <w:t>OLLAMA_URL=http://localhost:11434/api/embeddings</w:t>
       </w:r>
       <w:r>
+        <w:rPr>
+          <w:lang w:val="it-IT"/>
+        </w:rPr>
         <w:br/>
-        <w:t>EMBED_MODEL=nomic-embed-text</w:t>
-      </w:r>
-      <w:r>
+        <w:t>EMBED_MODEL=</w:t>
+      </w:r>
+      <w:proofErr w:type="spellStart"/>
+      <w:r>
+        <w:rPr>
+          <w:lang w:val="it-IT"/>
+        </w:rPr>
+        <w:t>nomic</w:t>
+      </w:r>
+      <w:proofErr w:type="spellEnd"/>
+      <w:r>
+        <w:rPr>
+          <w:lang w:val="it-IT"/>
+        </w:rPr>
+        <w:t>-</w:t>
+      </w:r>
+      <w:proofErr w:type="spellStart"/>
+      <w:r>
+        <w:rPr>
+          <w:lang w:val="it-IT"/>
+        </w:rPr>
+        <w:t>embed</w:t>
+      </w:r>
+      <w:proofErr w:type="spellEnd"/>
+      <w:r>
+        <w:rPr>
+          <w:lang w:val="it-IT"/>
+        </w:rPr>
+        <w:t>-text</w:t>
+      </w:r>
+      <w:r>
+        <w:rPr>
+          <w:lang w:val="it-IT"/>
+        </w:rPr>
         <w:br/>
         <w:t>EMBED_BATCH=64</w:t>
       </w:r>
       <w:r>
+        <w:rPr>
+          <w:lang w:val="it-IT"/>
+        </w:rPr>
         <w:br/>
       </w:r>
     </w:p>
     <w:p>
       <w:pPr>
         <w:pStyle w:val="Titolo2"/>
+        <w:rPr>
+          <w:lang w:val="it-IT"/>
+        </w:rPr>
       </w:pPr>
       <w:r>
+        <w:rPr>
+          <w:lang w:val="it-IT"/>
+        </w:rPr>
         <w:t>4. Script di elaborazione</w:t>
       </w:r>
     </w:p>
     <w:p>
-      <w:r>
-        <w:t>01_enrich_kb.py:</w:t>
-      </w:r>
-      <w:r>
+      <w:pPr>
+        <w:rPr>
+          <w:lang w:val="it-IT"/>
+        </w:rPr>
+      </w:pPr>
+      <w:r>
+        <w:rPr>
+          <w:lang w:val="it-IT"/>
+        </w:rPr>
+        <w:t>01_scrape_freud.py</w:t>
+      </w:r>
+      <w:r>
+        <w:rPr>
+          <w:lang w:val="it-IT"/>
+        </w:rPr>
+        <w:t>:</w:t>
+      </w:r>
+      <w:r>
+        <w:rPr>
+          <w:lang w:val="it-IT"/>
+        </w:rPr>
         <w:br/>
         <w:t>- Scarica pagine HTML</w:t>
       </w:r>
       <w:r>
+        <w:rPr>
+          <w:lang w:val="it-IT"/>
+        </w:rPr>
         <w:br/>
         <w:t>- Pulisce i contenuti</w:t>
       </w:r>
       <w:r>
+        <w:rPr>
+          <w:lang w:val="it-IT"/>
+        </w:rPr>
         <w:br/>
         <w:t>- Estrarre testo dai PDF</w:t>
       </w:r>
       <w:r>
+        <w:rPr>
+          <w:lang w:val="it-IT"/>
+        </w:rPr>
         <w:br/>
-        <w:t>- Divide tutto in chunk</w:t>
-      </w:r>
-      <w:r>
+        <w:t xml:space="preserve">- Divide tutto in </w:t>
+      </w:r>
+      <w:proofErr w:type="spellStart"/>
+      <w:r>
+        <w:rPr>
+          <w:lang w:val="it-IT"/>
+        </w:rPr>
+        <w:t>chunk</w:t>
+      </w:r>
+      <w:proofErr w:type="spellEnd"/>
+      <w:r>
+        <w:rPr>
+          <w:lang w:val="it-IT"/>
+        </w:rPr>
         <w:br/>
         <w:t>- Scrive i file JSONL</w:t>
       </w:r>
       <w:r>
+        <w:rPr>
+          <w:lang w:val="it-IT"/>
+        </w:rPr>
         <w:br/>
       </w:r>
       <w:r>
+        <w:rPr>
+          <w:lang w:val="it-IT"/>
+        </w:rPr>
         <w:br/>
-        <w:t>02_index_chroma.py:</w:t>
-      </w:r>
-      <w:r>
+      </w:r>
+      <w:r>
+        <w:rPr>
+          <w:lang w:val="it-IT"/>
+        </w:rPr>
+        <w:t>03_index_freud.py</w:t>
+      </w:r>
+      <w:r>
+        <w:rPr>
+          <w:lang w:val="it-IT"/>
+        </w:rPr>
+        <w:t>:</w:t>
+      </w:r>
+      <w:r>
+        <w:rPr>
+          <w:lang w:val="it-IT"/>
+        </w:rPr>
         <w:br/>
-        <w:t>- Legge i chunk</w:t>
-      </w:r>
-      <w:r>
+        <w:t xml:space="preserve">- Legge i </w:t>
+      </w:r>
+      <w:proofErr w:type="spellStart"/>
+      <w:r>
+        <w:rPr>
+          <w:lang w:val="it-IT"/>
+        </w:rPr>
+        <w:t>chunk</w:t>
+      </w:r>
+      <w:proofErr w:type="spellEnd"/>
+      <w:r>
+        <w:rPr>
+          <w:lang w:val="it-IT"/>
+        </w:rPr>
         <w:br/>
-        <w:t>- Genera embedding tramite Ollama</w:t>
-      </w:r>
-      <w:r>
+        <w:t xml:space="preserve">- Genera </w:t>
+      </w:r>
+      <w:proofErr w:type="spellStart"/>
+      <w:r>
+        <w:rPr>
+          <w:lang w:val="it-IT"/>
+        </w:rPr>
+        <w:t>embedding</w:t>
+      </w:r>
+      <w:proofErr w:type="spellEnd"/>
+      <w:r>
+        <w:rPr>
+          <w:lang w:val="it-IT"/>
+        </w:rPr>
+        <w:t xml:space="preserve"> tramite Ollama</w:t>
+      </w:r>
+      <w:r>
+        <w:rPr>
+          <w:lang w:val="it-IT"/>
+        </w:rPr>
         <w:br/>
-        <w:t>- Salva tutto dentro ChromaDB</w:t>
-      </w:r>
-      <w:r>
+        <w:t xml:space="preserve">- Salva tutto dentro </w:t>
+      </w:r>
+      <w:proofErr w:type="spellStart"/>
+      <w:r>
+        <w:rPr>
+          <w:lang w:val="it-IT"/>
+        </w:rPr>
+        <w:t>ChromaDB</w:t>
+      </w:r>
+      <w:proofErr w:type="spellEnd"/>
+      <w:r>
+        <w:rPr>
+          <w:lang w:val="it-IT"/>
+        </w:rPr>
         <w:br/>
       </w:r>
     </w:p>
     <w:p>
       <w:pPr>
         <w:pStyle w:val="Titolo2"/>
+        <w:rPr>
+          <w:lang w:val="it-IT"/>
+        </w:rPr>
       </w:pPr>
       <w:r>
+        <w:rPr>
+          <w:lang w:val="it-IT"/>
+        </w:rPr>
         <w:t>5. Test del RAG</w:t>
       </w:r>
     </w:p>
     <w:p>
-      <w:r>
+      <w:pPr>
+        <w:rPr>
+          <w:lang w:val="it-IT"/>
+        </w:rPr>
+      </w:pPr>
+      <w:r>
+        <w:rPr>
+          <w:lang w:val="it-IT"/>
+        </w:rPr>
         <w:t>Per testare il sistema, è sufficiente eseguire:</w:t>
       </w:r>
       <w:r>
+        <w:rPr>
+          <w:lang w:val="it-IT"/>
+        </w:rPr>
         <w:br/>
-        <w:t>python test_rag.py</w:t>
-      </w:r>
-      <w:r>
+      </w:r>
+      <w:proofErr w:type="spellStart"/>
+      <w:r>
+        <w:rPr>
+          <w:lang w:val="it-IT"/>
+        </w:rPr>
+        <w:t>python</w:t>
+      </w:r>
+      <w:proofErr w:type="spellEnd"/>
+      <w:r>
+        <w:rPr>
+          <w:lang w:val="it-IT"/>
+        </w:rPr>
+        <w:t xml:space="preserve"> test_rag.py</w:t>
+      </w:r>
+      <w:r>
+        <w:rPr>
+          <w:lang w:val="it-IT"/>
+        </w:rPr>
         <w:br/>
       </w:r>
     </w:p>
     <w:p>
       <w:pPr>
         <w:pStyle w:val="Titolo2"/>
+        <w:rPr>
+          <w:lang w:val="it-IT"/>
+        </w:rPr>
       </w:pPr>
       <w:r>
+        <w:rPr>
+          <w:lang w:val="it-IT"/>
+        </w:rPr>
         <w:t>6. Uso in Azure</w:t>
       </w:r>
     </w:p>
     <w:p>
-      <w:r>
+      <w:pPr>
+        <w:rPr>
+          <w:lang w:val="it-IT"/>
+        </w:rPr>
+      </w:pPr>
+      <w:r>
+        <w:rPr>
+          <w:lang w:val="it-IT"/>
+        </w:rPr>
         <w:t>La tecnologia non è solo didattica. Tutto può essere portato su Azure:</w:t>
       </w:r>
       <w:r>
+        <w:rPr>
+          <w:lang w:val="it-IT"/>
+        </w:rPr>
         <w:br/>
       </w:r>
       <w:r>
+        <w:rPr>
+          <w:lang w:val="it-IT"/>
+        </w:rPr>
         <w:br/>
-        <w:t>- Ollama può essere sostituito con Azure OpenAI Embeddings</w:t>
-      </w:r>
-      <w:r>
+        <w:t xml:space="preserve">- Ollama può essere sostituito con Azure OpenAI </w:t>
+      </w:r>
+      <w:proofErr w:type="spellStart"/>
+      <w:r>
+        <w:rPr>
+          <w:lang w:val="it-IT"/>
+        </w:rPr>
+        <w:t>Embeddings</w:t>
+      </w:r>
+      <w:proofErr w:type="spellEnd"/>
+      <w:r>
+        <w:rPr>
+          <w:lang w:val="it-IT"/>
+        </w:rPr>
         <w:br/>
-        <w:t>- ChromaDB può diventare Azure Cognitive Search o PostgreSQL con pgvector</w:t>
-      </w:r>
-      <w:r>
+        <w:t xml:space="preserve">- </w:t>
+      </w:r>
+      <w:proofErr w:type="spellStart"/>
+      <w:r>
+        <w:rPr>
+          <w:lang w:val="it-IT"/>
+        </w:rPr>
+        <w:t>ChromaDB</w:t>
+      </w:r>
+      <w:proofErr w:type="spellEnd"/>
+      <w:r>
+        <w:rPr>
+          <w:lang w:val="it-IT"/>
+        </w:rPr>
+        <w:t xml:space="preserve"> può diventare Azure Cognitive Search o </w:t>
+      </w:r>
+      <w:proofErr w:type="spellStart"/>
+      <w:r>
+        <w:rPr>
+          <w:lang w:val="it-IT"/>
+        </w:rPr>
+        <w:t>PostgreSQL</w:t>
+      </w:r>
+      <w:proofErr w:type="spellEnd"/>
+      <w:r>
+        <w:rPr>
+          <w:lang w:val="it-IT"/>
+        </w:rPr>
+        <w:t xml:space="preserve"> con </w:t>
+      </w:r>
+      <w:proofErr w:type="spellStart"/>
+      <w:r>
+        <w:rPr>
+          <w:lang w:val="it-IT"/>
+        </w:rPr>
+        <w:t>pgvector</w:t>
+      </w:r>
+      <w:proofErr w:type="spellEnd"/>
+      <w:r>
+        <w:rPr>
+          <w:lang w:val="it-IT"/>
+        </w:rPr>
         <w:br/>
         <w:t>- Gli script possono girare su Azure App Service</w:t>
       </w:r>
       <w:r>
+        <w:rPr>
+          <w:lang w:val="it-IT"/>
+        </w:rPr>
         <w:br/>
         <w:t>- Tutto può essere containerizzato con Docker + Azure Container Apps</w:t>
       </w:r>
       <w:r>
+        <w:rPr>
+          <w:lang w:val="it-IT"/>
+        </w:rPr>
         <w:br/>
       </w:r>
       <w:r>
+        <w:rPr>
+          <w:lang w:val="it-IT"/>
+        </w:rPr>
         <w:br/>
         <w:t>Questo permette scalabilità, sicurezza e uso professionale.</w:t>
       </w:r>
       <w:r>
+        <w:rPr>
+          <w:lang w:val="it-IT"/>
+        </w:rPr>
         <w:br/>
       </w:r>
     </w:p>
     <w:p>
       <w:pPr>
         <w:pStyle w:val="Titolo2"/>
+        <w:rPr>
+          <w:lang w:val="it-IT"/>
+        </w:rPr>
       </w:pPr>
       <w:r>
+        <w:rPr>
+          <w:lang w:val="it-IT"/>
+        </w:rPr>
         <w:lastRenderedPageBreak/>
         <w:t>7. Conclusione</w:t>
       </w:r>
     </w:p>
     <w:p>
-      <w:r>
+      <w:pPr>
+        <w:rPr>
+          <w:lang w:val="it-IT"/>
+        </w:rPr>
+      </w:pPr>
+      <w:r>
+        <w:rPr>
+          <w:lang w:val="it-IT"/>
+        </w:rPr>
         <w:t>Il progetto Freud-KB è ora completamente funzionante. L’obiettivo è di insegnare le basi delle pipeline RAG a Kevin, permettendogli di replicarle e comprenderle.</w:t>
       </w:r>
       <w:r>
+        <w:rPr>
+          <w:lang w:val="it-IT"/>
+        </w:rPr>
         <w:br/>
       </w:r>
       <w:r>
+        <w:rPr>
+          <w:lang w:val="it-IT"/>
+        </w:rPr>
         <w:br/>
         <w:t>Il sistema può crescere, essere pubblicato su Azure, integrato in chatbot, app web o automazioni aziendali.</w:t>
       </w:r>
       <w:r>
+        <w:rPr>
+          <w:lang w:val="it-IT"/>
+        </w:rPr>
         <w:br/>
       </w:r>
     </w:p>
@@ -1153,7 +1932,6 @@
   <w:style w:type="character" w:default="1" w:styleId="Carpredefinitoparagrafo">
     <w:name w:val="Default Paragraph Font"/>
     <w:uiPriority w:val="1"/>
-    <w:semiHidden/>
     <w:unhideWhenUsed/>
   </w:style>
   <w:style w:type="table" w:default="1" w:styleId="Tabellanormale">

</xml_diff>